<commit_message>
feat(hydrology): expand hydrological depth field and SVG rendering across all 100 catchment cells
</commit_message>
<xml_diff>
--- a/outputs/reports/flood_nowcasting_3hr_report_storm_01.docx
+++ b/outputs/reports/flood_nowcasting_3hr_report_storm_01.docx
@@ -121,7 +121,7 @@
           </w:tcPr>
           <w:p>
             <w:r>
-              <w:t>2026-08-25 07:32:39 UTC</w:t>
+              <w:t>2026-08-25 07:35:17 UTC</w:t>
             </w:r>
           </w:p>
         </w:tc>
@@ -224,7 +224,7 @@
         <w:t>This advisory report presents the synthesized 3-hour (180-minute) flood prediction results generated by the Urban Flood Nowcasting System. The simulation models a controlled convective storm event across the urban catchment domain, coupling 2D steepest-slope surface flow (D8) with 1D subterranean pipe drainage.</w:t>
         <w:br/>
         <w:br/>
-        <w:t>• Peak Surface Inundation: Reaches a domain maximum of 308.6 cm at t=60 min.</w:t>
+        <w:t>• Peak Surface Inundation: Reaches a domain maximum of 31.6 cm at t=60 min.</w:t>
         <w:br/>
         <w:t>• Maximum Surface Water Storage: Peak catchment volume of 783.24 m³.</w:t>
         <w:br/>
@@ -667,7 +667,7 @@
               <w:rPr>
                 <w:sz w:val="18"/>
               </w:rPr>
-              <w:t>79.5</w:t>
+              <w:t>8.1</w:t>
             </w:r>
           </w:p>
         </w:tc>
@@ -811,7 +811,7 @@
               <w:rPr>
                 <w:sz w:val="18"/>
               </w:rPr>
-              <w:t>153.6</w:t>
+              <w:t>15.7</w:t>
             </w:r>
           </w:p>
         </w:tc>
@@ -955,7 +955,7 @@
               <w:rPr>
                 <w:sz w:val="18"/>
               </w:rPr>
-              <w:t>217.3</w:t>
+              <w:t>22.3</w:t>
             </w:r>
           </w:p>
         </w:tc>
@@ -1099,7 +1099,7 @@
               <w:rPr>
                 <w:sz w:val="18"/>
               </w:rPr>
-              <w:t>266.4</w:t>
+              <w:t>27.3</w:t>
             </w:r>
           </w:p>
         </w:tc>
@@ -1243,7 +1243,7 @@
               <w:rPr>
                 <w:sz w:val="18"/>
               </w:rPr>
-              <w:t>297.6</w:t>
+              <w:t>30.5</w:t>
             </w:r>
           </w:p>
         </w:tc>
@@ -1387,7 +1387,7 @@
               <w:rPr>
                 <w:sz w:val="18"/>
               </w:rPr>
-              <w:t>308.6</w:t>
+              <w:t>31.6</w:t>
             </w:r>
           </w:p>
         </w:tc>
@@ -1531,7 +1531,7 @@
               <w:rPr>
                 <w:sz w:val="18"/>
               </w:rPr>
-              <w:t>269.1</w:t>
+              <w:t>27.6</w:t>
             </w:r>
           </w:p>
         </w:tc>
@@ -1675,7 +1675,7 @@
               <w:rPr>
                 <w:sz w:val="18"/>
               </w:rPr>
-              <w:t>158.2</w:t>
+              <w:t>16.2</w:t>
             </w:r>
           </w:p>
         </w:tc>
@@ -1819,7 +1819,7 @@
               <w:rPr>
                 <w:sz w:val="18"/>
               </w:rPr>
-              <w:t>5.4</w:t>
+              <w:t>0.5</w:t>
             </w:r>
           </w:p>
         </w:tc>

</xml_diff>